<commit_message>
Add Table M2 applicability pre-assessment to Methods outline
Extend the Methods chapter outline with Section 6.5: a 10-tendency x
3-scale x 3-site applicability matrix (Full / Adapted / Withheld /
N/A) pre-assessing where the reference protocol runs unmodified and
where preservation or excavation coverage requires adaptation, plus
three structural observations (no tendency lost wholesale;
complementary restriction patterns across sites; the Taosi scale
split aligns with hypothesis H-C). No new citations introduced.

Co-Authored-By: Claude Fable 5 <noreply@anthropic.com>
Claude-Session: https://claude.ai/code/session_0126cADkkdosaGbGqQZyRfmG
</commit_message>
<xml_diff>
--- a/docs/Methods_Chapter_Outline_Rui_Bai_v1.docx
+++ b/docs/Methods_Chapter_Outline_Rui_Bai_v1.docx
@@ -802,6 +802,1339 @@
     </w:tbl>
     <w:p>
       <w:pPr>
+        <w:pStyle w:val="Heading2"/>
+      </w:pPr>
+      <w:r>
+        <w:t>6.5 Table M2: Row-by-Scale-by-Site Applicability Pre-Assessment</w:t>
+      </w:r>
+    </w:p>
+    <w:p>
+      <w:r>
+        <w:t>Table M2 extends Table M1 to the full crossing of the framework: the ten tendencies of Table 1, by the three nested scales, by the three sites. Entries are a pre-assessment made from the published records and the reference implementation; they are finalized during digitization and re-issued with the Results. Codes: Full = reference protocol runs unmodified; Adapted = runs under the stated adaptation; Withheld = prerequisites not met, absence reported as a datum; N/A = the measure is a system-level property with no meaning at that scale. HH = building/household scale, CL = cluster/neighborhood scale (at Taosi: precinct), ST = settlement scale. All Jiahu entries are per sub-phase; all Taosi entries are per period.</w:t>
+      </w:r>
+    </w:p>
+    <w:tbl>
+      <w:tblPr>
+        <w:tblStyle w:val="TableGrid"/>
+        <w:tblW w:type="auto" w:w="0"/>
+        <w:tblLook w:firstColumn="1" w:firstRow="1" w:lastColumn="0" w:lastRow="0" w:noHBand="0" w:noVBand="1" w:val="04A0"/>
+      </w:tblPr>
+      <w:tblGrid>
+        <w:gridCol w:w="2160"/>
+        <w:gridCol w:w="2160"/>
+        <w:gridCol w:w="2160"/>
+        <w:gridCol w:w="2160"/>
+      </w:tblGrid>
+      <w:tr>
+        <w:tc>
+          <w:tcPr>
+            <w:tcW w:type="dxa" w:w="2160"/>
+          </w:tcPr>
+          <w:p>
+            <w:r>
+              <w:t>Tendency x scale</w:t>
+            </w:r>
+          </w:p>
+        </w:tc>
+        <w:tc>
+          <w:tcPr>
+            <w:tcW w:type="dxa" w:w="2160"/>
+          </w:tcPr>
+          <w:p>
+            <w:r>
+              <w:t>Jiangzhai Phase I</w:t>
+            </w:r>
+          </w:p>
+        </w:tc>
+        <w:tc>
+          <w:tcPr>
+            <w:tcW w:type="dxa" w:w="2160"/>
+          </w:tcPr>
+          <w:p>
+            <w:r>
+              <w:t>Jiahu</w:t>
+            </w:r>
+          </w:p>
+        </w:tc>
+        <w:tc>
+          <w:tcPr>
+            <w:tcW w:type="dxa" w:w="2160"/>
+          </w:tcPr>
+          <w:p>
+            <w:r>
+              <w:t>Taosi</w:t>
+            </w:r>
+          </w:p>
+        </w:tc>
+      </w:tr>
+      <w:tr>
+        <w:tc>
+          <w:tcPr>
+            <w:tcW w:type="dxa" w:w="2160"/>
+          </w:tcPr>
+          <w:p>
+            <w:r>
+              <w:t>1 Wealth &amp; consumption - HH</w:t>
+            </w:r>
+          </w:p>
+        </w:tc>
+        <w:tc>
+          <w:tcPr>
+            <w:tcW w:type="dxa" w:w="2160"/>
+          </w:tcPr>
+          <w:p>
+            <w:r>
+              <w:t>Full</w:t>
+            </w:r>
+          </w:p>
+        </w:tc>
+        <w:tc>
+          <w:tcPr>
+            <w:tcW w:type="dxa" w:w="2160"/>
+          </w:tcPr>
+          <w:p>
+            <w:r>
+              <w:t>Full (reduced n; power reported)</w:t>
+            </w:r>
+          </w:p>
+        </w:tc>
+        <w:tc>
+          <w:tcPr>
+            <w:tcW w:type="dxa" w:w="2160"/>
+          </w:tcPr>
+          <w:p>
+            <w:r>
+              <w:t>Adapted: excavated precincts only</w:t>
+            </w:r>
+          </w:p>
+        </w:tc>
+      </w:tr>
+      <w:tr>
+        <w:tc>
+          <w:tcPr>
+            <w:tcW w:type="dxa" w:w="2160"/>
+          </w:tcPr>
+          <w:p>
+            <w:r>
+              <w:t>1 Wealth &amp; consumption - CL</w:t>
+            </w:r>
+          </w:p>
+        </w:tc>
+        <w:tc>
+          <w:tcPr>
+            <w:tcW w:type="dxa" w:w="2160"/>
+          </w:tcPr>
+          <w:p>
+            <w:r>
+              <w:t>Full</w:t>
+            </w:r>
+          </w:p>
+        </w:tc>
+        <w:tc>
+          <w:tcPr>
+            <w:tcW w:type="dxa" w:w="2160"/>
+          </w:tcPr>
+          <w:p>
+            <w:r>
+              <w:t>Adapted: clusters re-derived per sub-phase exposure</w:t>
+            </w:r>
+          </w:p>
+        </w:tc>
+        <w:tc>
+          <w:tcPr>
+            <w:tcW w:type="dxa" w:w="2160"/>
+          </w:tcPr>
+          <w:p>
+            <w:r>
+              <w:t>Adapted: between-precinct comparison on zone-level registers</w:t>
+            </w:r>
+          </w:p>
+        </w:tc>
+      </w:tr>
+      <w:tr>
+        <w:tc>
+          <w:tcPr>
+            <w:tcW w:type="dxa" w:w="2160"/>
+          </w:tcPr>
+          <w:p>
+            <w:r>
+              <w:t>1 Wealth &amp; consumption - ST</w:t>
+            </w:r>
+          </w:p>
+        </w:tc>
+        <w:tc>
+          <w:tcPr>
+            <w:tcW w:type="dxa" w:w="2160"/>
+          </w:tcPr>
+          <w:p>
+            <w:r>
+              <w:t>Full</w:t>
+            </w:r>
+          </w:p>
+        </w:tc>
+        <w:tc>
+          <w:tcPr>
+            <w:tcW w:type="dxa" w:w="2160"/>
+          </w:tcPr>
+          <w:p>
+            <w:r>
+              <w:t>Adapted: exposure-conditioned; edge-effect checks</w:t>
+            </w:r>
+          </w:p>
+        </w:tc>
+        <w:tc>
+          <w:tcPr>
+            <w:tcW w:type="dxa" w:w="2160"/>
+          </w:tcPr>
+          <w:p>
+            <w:r>
+              <w:t>Adapted: zone-resolution aggregates joined to skeleton values; interpretive</w:t>
+            </w:r>
+          </w:p>
+        </w:tc>
+      </w:tr>
+      <w:tr>
+        <w:tc>
+          <w:tcPr>
+            <w:tcW w:type="dxa" w:w="2160"/>
+          </w:tcPr>
+          <w:p>
+            <w:r>
+              <w:t>2 Power arrangements - HH</w:t>
+            </w:r>
+          </w:p>
+        </w:tc>
+        <w:tc>
+          <w:tcPr>
+            <w:tcW w:type="dxa" w:w="2160"/>
+          </w:tcPr>
+          <w:p>
+            <w:r>
+              <w:t>Full</w:t>
+            </w:r>
+          </w:p>
+        </w:tc>
+        <w:tc>
+          <w:tcPr>
+            <w:tcW w:type="dxa" w:w="2160"/>
+          </w:tcPr>
+          <w:p>
+            <w:r>
+              <w:t>Full (reduced n)</w:t>
+            </w:r>
+          </w:p>
+        </w:tc>
+        <w:tc>
+          <w:tcPr>
+            <w:tcW w:type="dxa" w:w="2160"/>
+          </w:tcPr>
+          <w:p>
+            <w:r>
+              <w:t>Adapted: within precincts</w:t>
+            </w:r>
+          </w:p>
+        </w:tc>
+      </w:tr>
+      <w:tr>
+        <w:tc>
+          <w:tcPr>
+            <w:tcW w:type="dxa" w:w="2160"/>
+          </w:tcPr>
+          <w:p>
+            <w:r>
+              <w:t>2 Power arrangements - CL</w:t>
+            </w:r>
+          </w:p>
+        </w:tc>
+        <w:tc>
+          <w:tcPr>
+            <w:tcW w:type="dxa" w:w="2160"/>
+          </w:tcPr>
+          <w:p>
+            <w:r>
+              <w:t>Full (Kruskal-Wallis across five groups)</w:t>
+            </w:r>
+          </w:p>
+        </w:tc>
+        <w:tc>
+          <w:tcPr>
+            <w:tcW w:type="dxa" w:w="2160"/>
+          </w:tcPr>
+          <w:p>
+            <w:r>
+              <w:t>Adapted: per sub-phase clusters</w:t>
+            </w:r>
+          </w:p>
+        </w:tc>
+        <w:tc>
+          <w:tcPr>
+            <w:tcW w:type="dxa" w:w="2160"/>
+          </w:tcPr>
+          <w:p>
+            <w:r>
+              <w:t>Adapted: between-precinct comparison</w:t>
+            </w:r>
+          </w:p>
+        </w:tc>
+      </w:tr>
+      <w:tr>
+        <w:tc>
+          <w:tcPr>
+            <w:tcW w:type="dxa" w:w="2160"/>
+          </w:tcPr>
+          <w:p>
+            <w:r>
+              <w:t>2 Power arrangements - ST</w:t>
+            </w:r>
+          </w:p>
+        </w:tc>
+        <w:tc>
+          <w:tcPr>
+            <w:tcW w:type="dxa" w:w="2160"/>
+          </w:tcPr>
+          <w:p>
+            <w:r>
+              <w:t>Full (Choice/Control CV; step-depth symmetry)</w:t>
+            </w:r>
+          </w:p>
+        </w:tc>
+        <w:tc>
+          <w:tcPr>
+            <w:tcW w:type="dxa" w:w="2160"/>
+          </w:tcPr>
+          <w:p>
+            <w:r>
+              <w:t>Adapted: CV over exposed graph only</w:t>
+            </w:r>
+          </w:p>
+        </w:tc>
+        <w:tc>
+          <w:tcPr>
+            <w:tcW w:type="dxa" w:w="2160"/>
+          </w:tcPr>
+          <w:p>
+            <w:r>
+              <w:t>Full on skeleton graph, with reconstruction sensitivity (gates, corridors)</w:t>
+            </w:r>
+          </w:p>
+        </w:tc>
+      </w:tr>
+      <w:tr>
+        <w:tc>
+          <w:tcPr>
+            <w:tcW w:type="dxa" w:w="2160"/>
+          </w:tcPr>
+          <w:p>
+            <w:r>
+              <w:t>3 Basis of status / legibility - HH</w:t>
+            </w:r>
+          </w:p>
+        </w:tc>
+        <w:tc>
+          <w:tcPr>
+            <w:tcW w:type="dxa" w:w="2160"/>
+          </w:tcPr>
+          <w:p>
+            <w:r>
+              <w:t>N/A (system-level measure)</w:t>
+            </w:r>
+          </w:p>
+        </w:tc>
+        <w:tc>
+          <w:tcPr>
+            <w:tcW w:type="dxa" w:w="2160"/>
+          </w:tcPr>
+          <w:p>
+            <w:r>
+              <w:t>N/A</w:t>
+            </w:r>
+          </w:p>
+        </w:tc>
+        <w:tc>
+          <w:tcPr>
+            <w:tcW w:type="dxa" w:w="2160"/>
+          </w:tcPr>
+          <w:p>
+            <w:r>
+              <w:t>N/A</w:t>
+            </w:r>
+          </w:p>
+        </w:tc>
+      </w:tr>
+      <w:tr>
+        <w:tc>
+          <w:tcPr>
+            <w:tcW w:type="dxa" w:w="2160"/>
+          </w:tcPr>
+          <w:p>
+            <w:r>
+              <w:t>3 Basis of status / legibility - CL</w:t>
+            </w:r>
+          </w:p>
+        </w:tc>
+        <w:tc>
+          <w:tcPr>
+            <w:tcW w:type="dxa" w:w="2160"/>
+          </w:tcPr>
+          <w:p>
+            <w:r>
+              <w:t>Adapted: exploratory subgraph intelligibility</w:t>
+            </w:r>
+          </w:p>
+        </w:tc>
+        <w:tc>
+          <w:tcPr>
+            <w:tcW w:type="dxa" w:w="2160"/>
+          </w:tcPr>
+          <w:p>
+            <w:r>
+              <w:t>Adapted: within-exposure subgraphs</w:t>
+            </w:r>
+          </w:p>
+        </w:tc>
+        <w:tc>
+          <w:tcPr>
+            <w:tcW w:type="dxa" w:w="2160"/>
+          </w:tcPr>
+          <w:p>
+            <w:r>
+              <w:t>Full within contiguous precincts</w:t>
+            </w:r>
+          </w:p>
+        </w:tc>
+      </w:tr>
+      <w:tr>
+        <w:tc>
+          <w:tcPr>
+            <w:tcW w:type="dxa" w:w="2160"/>
+          </w:tcPr>
+          <w:p>
+            <w:r>
+              <w:t>3 Basis of status / legibility - ST</w:t>
+            </w:r>
+          </w:p>
+        </w:tc>
+        <w:tc>
+          <w:tcPr>
+            <w:tcW w:type="dxa" w:w="2160"/>
+          </w:tcPr>
+          <w:p>
+            <w:r>
+              <w:t>Full (intelligibility R2; construction-B caveat)</w:t>
+            </w:r>
+          </w:p>
+        </w:tc>
+        <w:tc>
+          <w:tcPr>
+            <w:tcW w:type="dxa" w:w="2160"/>
+          </w:tcPr>
+          <w:p>
+            <w:r>
+              <w:t>Adapted: strong edge-effect caveat</w:t>
+            </w:r>
+          </w:p>
+        </w:tc>
+        <w:tc>
+          <w:tcPr>
+            <w:tcW w:type="dxa" w:w="2160"/>
+          </w:tcPr>
+          <w:p>
+            <w:r>
+              <w:t>Adapted: skeleton intelligibility read only across competing reconstructions</w:t>
+            </w:r>
+          </w:p>
+        </w:tc>
+      </w:tr>
+      <w:tr>
+        <w:tc>
+          <w:tcPr>
+            <w:tcW w:type="dxa" w:w="2160"/>
+          </w:tcPr>
+          <w:p>
+            <w:r>
+              <w:t>4 Political dynamics - HH</w:t>
+            </w:r>
+          </w:p>
+        </w:tc>
+        <w:tc>
+          <w:tcPr>
+            <w:tcW w:type="dxa" w:w="2160"/>
+          </w:tcPr>
+          <w:p>
+            <w:r>
+              <w:t>Full (house-to-plaza depths)</w:t>
+            </w:r>
+          </w:p>
+        </w:tc>
+        <w:tc>
+          <w:tcPr>
+            <w:tcW w:type="dxa" w:w="2160"/>
+          </w:tcPr>
+          <w:p>
+            <w:r>
+              <w:t>Adapted: depths to candidate shared spaces</w:t>
+            </w:r>
+          </w:p>
+        </w:tc>
+        <w:tc>
+          <w:tcPr>
+            <w:tcW w:type="dxa" w:w="2160"/>
+          </w:tcPr>
+          <w:p>
+            <w:r>
+              <w:t>Adapted: within precincts</w:t>
+            </w:r>
+          </w:p>
+        </w:tc>
+      </w:tr>
+      <w:tr>
+        <w:tc>
+          <w:tcPr>
+            <w:tcW w:type="dxa" w:w="2160"/>
+          </w:tcPr>
+          <w:p>
+            <w:r>
+              <w:t>4 Political dynamics - CL</w:t>
+            </w:r>
+          </w:p>
+        </w:tc>
+        <w:tc>
+          <w:tcPr>
+            <w:tcW w:type="dxa" w:w="2160"/>
+          </w:tcPr>
+          <w:p>
+            <w:r>
+              <w:t>Full (inter-cluster parity to plaza)</w:t>
+            </w:r>
+          </w:p>
+        </w:tc>
+        <w:tc>
+          <w:tcPr>
+            <w:tcW w:type="dxa" w:w="2160"/>
+          </w:tcPr>
+          <w:p>
+            <w:r>
+              <w:t>Adapted: candidate communal nodes identified first from configuration + AZA</w:t>
+            </w:r>
+          </w:p>
+        </w:tc>
+        <w:tc>
+          <w:tcPr>
+            <w:tcW w:type="dxa" w:w="2160"/>
+          </w:tcPr>
+          <w:p>
+            <w:r>
+              <w:t>Adapted: precinct-to-public-precinct depths</w:t>
+            </w:r>
+          </w:p>
+        </w:tc>
+      </w:tr>
+      <w:tr>
+        <w:tc>
+          <w:tcPr>
+            <w:tcW w:type="dxa" w:w="2160"/>
+          </w:tcPr>
+          <w:p>
+            <w:r>
+              <w:t>4 Political dynamics - ST</w:t>
+            </w:r>
+          </w:p>
+        </w:tc>
+        <w:tc>
+          <w:tcPr>
+            <w:tcW w:type="dxa" w:w="2160"/>
+          </w:tcPr>
+          <w:p>
+            <w:r>
+              <w:t>Full</w:t>
+            </w:r>
+          </w:p>
+        </w:tc>
+        <w:tc>
+          <w:tcPr>
+            <w:tcW w:type="dxa" w:w="2160"/>
+          </w:tcPr>
+          <w:p>
+            <w:r>
+              <w:t>Withheld if no communal node is identifiable; absence reported</w:t>
+            </w:r>
+          </w:p>
+        </w:tc>
+        <w:tc>
+          <w:tcPr>
+            <w:tcW w:type="dxa" w:w="2160"/>
+          </w:tcPr>
+          <w:p>
+            <w:r>
+              <w:t>Full on skeleton: residential zones to public/ceremonial precincts, candidate-node sensitivity</w:t>
+            </w:r>
+          </w:p>
+        </w:tc>
+      </w:tr>
+      <w:tr>
+        <w:tc>
+          <w:tcPr>
+            <w:tcW w:type="dxa" w:w="2160"/>
+          </w:tcPr>
+          <w:p>
+            <w:r>
+              <w:t>5 Production - HH</w:t>
+            </w:r>
+          </w:p>
+        </w:tc>
+        <w:tc>
+          <w:tcPr>
+            <w:tcW w:type="dxa" w:w="2160"/>
+          </w:tcPr>
+          <w:p>
+            <w:r>
+              <w:t>Full</w:t>
+            </w:r>
+          </w:p>
+        </w:tc>
+        <w:tc>
+          <w:tcPr>
+            <w:tcW w:type="dxa" w:w="2160"/>
+          </w:tcPr>
+          <w:p>
+            <w:r>
+              <w:t>Full (production evidence in houses/pits)</w:t>
+            </w:r>
+          </w:p>
+        </w:tc>
+        <w:tc>
+          <w:tcPr>
+            <w:tcW w:type="dxa" w:w="2160"/>
+          </w:tcPr>
+          <w:p>
+            <w:r>
+              <w:t>Adapted: within precincts</w:t>
+            </w:r>
+          </w:p>
+        </w:tc>
+      </w:tr>
+      <w:tr>
+        <w:tc>
+          <w:tcPr>
+            <w:tcW w:type="dxa" w:w="2160"/>
+          </w:tcPr>
+          <w:p>
+            <w:r>
+              <w:t>5 Production - CL</w:t>
+            </w:r>
+          </w:p>
+        </w:tc>
+        <w:tc>
+          <w:tcPr>
+            <w:tcW w:type="dxa" w:w="2160"/>
+          </w:tcPr>
+          <w:p>
+            <w:r>
+              <w:t>Full (kiln and processing loci)</w:t>
+            </w:r>
+          </w:p>
+        </w:tc>
+        <w:tc>
+          <w:tcPr>
+            <w:tcW w:type="dxa" w:w="2160"/>
+          </w:tcPr>
+          <w:p>
+            <w:r>
+              <w:t>Adapted: zones identified via AZA first</w:t>
+            </w:r>
+          </w:p>
+        </w:tc>
+        <w:tc>
+          <w:tcPr>
+            <w:tcW w:type="dxa" w:w="2160"/>
+          </w:tcPr>
+          <w:p>
+            <w:r>
+              <w:t>Full where craft precincts are documented</w:t>
+            </w:r>
+          </w:p>
+        </w:tc>
+      </w:tr>
+      <w:tr>
+        <w:tc>
+          <w:tcPr>
+            <w:tcW w:type="dxa" w:w="2160"/>
+          </w:tcPr>
+          <w:p>
+            <w:r>
+              <w:t>5 Production - ST</w:t>
+            </w:r>
+          </w:p>
+        </w:tc>
+        <w:tc>
+          <w:tcPr>
+            <w:tcW w:type="dxa" w:w="2160"/>
+          </w:tcPr>
+          <w:p>
+            <w:r>
+              <w:t>Full</w:t>
+            </w:r>
+          </w:p>
+        </w:tc>
+        <w:tc>
+          <w:tcPr>
+            <w:tcW w:type="dxa" w:w="2160"/>
+          </w:tcPr>
+          <w:p>
+            <w:r>
+              <w:t>Adapted: exposure-conditioned</w:t>
+            </w:r>
+          </w:p>
+        </w:tc>
+        <w:tc>
+          <w:tcPr>
+            <w:tcW w:type="dxa" w:w="2160"/>
+          </w:tcPr>
+          <w:p>
+            <w:r>
+              <w:t>Adapted: zone-resolution placement of craft areas relative to skeleton</w:t>
+            </w:r>
+          </w:p>
+        </w:tc>
+      </w:tr>
+      <w:tr>
+        <w:tc>
+          <w:tcPr>
+            <w:tcW w:type="dxa" w:w="2160"/>
+          </w:tcPr>
+          <w:p>
+            <w:r>
+              <w:t>6 Finance - HH</w:t>
+            </w:r>
+          </w:p>
+        </w:tc>
+        <w:tc>
+          <w:tcPr>
+            <w:tcW w:type="dxa" w:w="2160"/>
+          </w:tcPr>
+          <w:p>
+            <w:r>
+              <w:t>Full (household storage)</w:t>
+            </w:r>
+          </w:p>
+        </w:tc>
+        <w:tc>
+          <w:tcPr>
+            <w:tcW w:type="dxa" w:w="2160"/>
+          </w:tcPr>
+          <w:p>
+            <w:r>
+              <w:t>Full</w:t>
+            </w:r>
+          </w:p>
+        </w:tc>
+        <w:tc>
+          <w:tcPr>
+            <w:tcW w:type="dxa" w:w="2160"/>
+          </w:tcPr>
+          <w:p>
+            <w:r>
+              <w:t>Adapted: within precincts</w:t>
+            </w:r>
+          </w:p>
+        </w:tc>
+      </w:tr>
+      <w:tr>
+        <w:tc>
+          <w:tcPr>
+            <w:tcW w:type="dxa" w:w="2160"/>
+          </w:tcPr>
+          <w:p>
+            <w:r>
+              <w:t>6 Finance - CL</w:t>
+            </w:r>
+          </w:p>
+        </w:tc>
+        <w:tc>
+          <w:tcPr>
+            <w:tcW w:type="dxa" w:w="2160"/>
+          </w:tcPr>
+          <w:p>
+            <w:r>
+              <w:t>Full (pit placement vs clusters)</w:t>
+            </w:r>
+          </w:p>
+        </w:tc>
+        <w:tc>
+          <w:tcPr>
+            <w:tcW w:type="dxa" w:w="2160"/>
+          </w:tcPr>
+          <w:p>
+            <w:r>
+              <w:t>Full per sub-phase</w:t>
+            </w:r>
+          </w:p>
+        </w:tc>
+        <w:tc>
+          <w:tcPr>
+            <w:tcW w:type="dxa" w:w="2160"/>
+          </w:tcPr>
+          <w:p>
+            <w:r>
+              <w:t>Full: palace-attached vs residential storage contrast</w:t>
+            </w:r>
+          </w:p>
+        </w:tc>
+      </w:tr>
+      <w:tr>
+        <w:tc>
+          <w:tcPr>
+            <w:tcW w:type="dxa" w:w="2160"/>
+          </w:tcPr>
+          <w:p>
+            <w:r>
+              <w:t>6 Finance - ST</w:t>
+            </w:r>
+          </w:p>
+        </w:tc>
+        <w:tc>
+          <w:tcPr>
+            <w:tcW w:type="dxa" w:w="2160"/>
+          </w:tcPr>
+          <w:p>
+            <w:r>
+              <w:t>Full (295-pit register; placement vs CSR)</w:t>
+            </w:r>
+          </w:p>
+        </w:tc>
+        <w:tc>
+          <w:tcPr>
+            <w:tcW w:type="dxa" w:w="2160"/>
+          </w:tcPr>
+          <w:p>
+            <w:r>
+              <w:t>Adapted: exposure-conditioned placement tests</w:t>
+            </w:r>
+          </w:p>
+        </w:tc>
+        <w:tc>
+          <w:tcPr>
+            <w:tcW w:type="dxa" w:w="2160"/>
+          </w:tcPr>
+          <w:p>
+            <w:r>
+              <w:t>Adapted: storage precincts at zone resolution</w:t>
+            </w:r>
+          </w:p>
+        </w:tc>
+      </w:tr>
+      <w:tr>
+        <w:tc>
+          <w:tcPr>
+            <w:tcW w:type="dxa" w:w="2160"/>
+          </w:tcPr>
+          <w:p>
+            <w:r>
+              <w:t>7 Mortuary - HH</w:t>
+            </w:r>
+          </w:p>
+        </w:tc>
+        <w:tc>
+          <w:tcPr>
+            <w:tcW w:type="dxa" w:w="2160"/>
+          </w:tcPr>
+          <w:p>
+            <w:r>
+              <w:t>Full (grave-good Gini/CV, bootstrap)</w:t>
+            </w:r>
+          </w:p>
+        </w:tc>
+        <w:tc>
+          <w:tcPr>
+            <w:tcW w:type="dxa" w:w="2160"/>
+          </w:tcPr>
+          <w:p>
+            <w:r>
+              <w:t>Full</w:t>
+            </w:r>
+          </w:p>
+        </w:tc>
+        <w:tc>
+          <w:tcPr>
+            <w:tcW w:type="dxa" w:w="2160"/>
+          </w:tcPr>
+          <w:p>
+            <w:r>
+              <w:t>Adapted: published subsample; selection-bias assessment</w:t>
+            </w:r>
+          </w:p>
+        </w:tc>
+      </w:tr>
+      <w:tr>
+        <w:tc>
+          <w:tcPr>
+            <w:tcW w:type="dxa" w:w="2160"/>
+          </w:tcPr>
+          <w:p>
+            <w:r>
+              <w:t>7 Mortuary - CL</w:t>
+            </w:r>
+          </w:p>
+        </w:tc>
+        <w:tc>
+          <w:tcPr>
+            <w:tcW w:type="dxa" w:w="2160"/>
+          </w:tcPr>
+          <w:p>
+            <w:r>
+              <w:t>Adapted: cemetery zones not linkable to residential groups; context only</w:t>
+            </w:r>
+          </w:p>
+        </w:tc>
+        <w:tc>
+          <w:tcPr>
+            <w:tcW w:type="dxa" w:w="2160"/>
+          </w:tcPr>
+          <w:p>
+            <w:r>
+              <w:t>Full: interspersed burials permit spatial linkage</w:t>
+            </w:r>
+          </w:p>
+        </w:tc>
+        <w:tc>
+          <w:tcPr>
+            <w:tcW w:type="dxa" w:w="2160"/>
+          </w:tcPr>
+          <w:p>
+            <w:r>
+              <w:t>Adapted: cemetery precinct configuration partially known</w:t>
+            </w:r>
+          </w:p>
+        </w:tc>
+      </w:tr>
+      <w:tr>
+        <w:tc>
+          <w:tcPr>
+            <w:tcW w:type="dxa" w:w="2160"/>
+          </w:tcPr>
+          <w:p>
+            <w:r>
+              <w:t>7 Mortuary - ST</w:t>
+            </w:r>
+          </w:p>
+        </w:tc>
+        <w:tc>
+          <w:tcPr>
+            <w:tcW w:type="dxa" w:w="2160"/>
+          </w:tcPr>
+          <w:p>
+            <w:r>
+              <w:t>Adapted: settlement-level values linked interpretively</w:t>
+            </w:r>
+          </w:p>
+        </w:tc>
+        <w:tc>
+          <w:tcPr>
+            <w:tcW w:type="dxa" w:w="2160"/>
+          </w:tcPr>
+          <w:p>
+            <w:r>
+              <w:t>Full per sub-phase</w:t>
+            </w:r>
+          </w:p>
+        </w:tc>
+        <w:tc>
+          <w:tcPr>
+            <w:tcW w:type="dxa" w:w="2160"/>
+          </w:tcPr>
+          <w:p>
+            <w:r>
+              <w:t>Adapted: interpretive linkage, per Table 1</w:t>
+            </w:r>
+          </w:p>
+        </w:tc>
+      </w:tr>
+      <w:tr>
+        <w:tc>
+          <w:tcPr>
+            <w:tcW w:type="dxa" w:w="2160"/>
+          </w:tcPr>
+          <w:p>
+            <w:r>
+              <w:t>8 Ritual architecture - HH</w:t>
+            </w:r>
+          </w:p>
+        </w:tc>
+        <w:tc>
+          <w:tcPr>
+            <w:tcW w:type="dxa" w:w="2160"/>
+          </w:tcPr>
+          <w:p>
+            <w:r>
+              <w:t>Adapted: large communal buildings as candidates (e.g., F1)</w:t>
+            </w:r>
+          </w:p>
+        </w:tc>
+        <w:tc>
+          <w:tcPr>
+            <w:tcW w:type="dxa" w:w="2160"/>
+          </w:tcPr>
+          <w:p>
+            <w:r>
+              <w:t>Withheld: no identified ritual structures; portable/mortuary ritual instead</w:t>
+            </w:r>
+          </w:p>
+        </w:tc>
+        <w:tc>
+          <w:tcPr>
+            <w:tcW w:type="dxa" w:w="2160"/>
+          </w:tcPr>
+          <w:p>
+            <w:r>
+              <w:t>Full: ceremonial structures within palatial/ritual precincts</w:t>
+            </w:r>
+          </w:p>
+        </w:tc>
+      </w:tr>
+      <w:tr>
+        <w:tc>
+          <w:tcPr>
+            <w:tcW w:type="dxa" w:w="2160"/>
+          </w:tcPr>
+          <w:p>
+            <w:r>
+              <w:t>8 Ritual architecture - CL</w:t>
+            </w:r>
+          </w:p>
+        </w:tc>
+        <w:tc>
+          <w:tcPr>
+            <w:tcW w:type="dxa" w:w="2160"/>
+          </w:tcPr>
+          <w:p>
+            <w:r>
+              <w:t>Adapted: plaza as candidate; capacity estimate Full</w:t>
+            </w:r>
+          </w:p>
+        </w:tc>
+        <w:tc>
+          <w:tcPr>
+            <w:tcW w:type="dxa" w:w="2160"/>
+          </w:tcPr>
+          <w:p>
+            <w:r>
+              <w:t>Withheld unless candidates emerge from AZA; absence itself reported</w:t>
+            </w:r>
+          </w:p>
+        </w:tc>
+        <w:tc>
+          <w:tcPr>
+            <w:tcW w:type="dxa" w:w="2160"/>
+          </w:tcPr>
+          <w:p>
+            <w:r>
+              <w:t>Full: observatory/altar precinct; capacity estimable</w:t>
+            </w:r>
+          </w:p>
+        </w:tc>
+      </w:tr>
+      <w:tr>
+        <w:tc>
+          <w:tcPr>
+            <w:tcW w:type="dxa" w:w="2160"/>
+          </w:tcPr>
+          <w:p>
+            <w:r>
+              <w:t>8 Ritual architecture - ST</w:t>
+            </w:r>
+          </w:p>
+        </w:tc>
+        <w:tc>
+          <w:tcPr>
+            <w:tcW w:type="dxa" w:w="2160"/>
+          </w:tcPr>
+          <w:p>
+            <w:r>
+              <w:t>Full: plaza integration/VGA/capacity</w:t>
+            </w:r>
+          </w:p>
+        </w:tc>
+        <w:tc>
+          <w:tcPr>
+            <w:tcW w:type="dxa" w:w="2160"/>
+          </w:tcPr>
+          <w:p>
+            <w:r>
+              <w:t>Withheld (as above)</w:t>
+            </w:r>
+          </w:p>
+        </w:tc>
+        <w:tc>
+          <w:tcPr>
+            <w:tcW w:type="dxa" w:w="2160"/>
+          </w:tcPr>
+          <w:p>
+            <w:r>
+              <w:t>Adapted: precinct placement on skeleton; VGA within exposures</w:t>
+            </w:r>
+          </w:p>
+        </w:tc>
+      </w:tr>
+      <w:tr>
+        <w:tc>
+          <w:tcPr>
+            <w:tcW w:type="dxa" w:w="2160"/>
+          </w:tcPr>
+          <w:p>
+            <w:r>
+              <w:t>9 Legitimation &amp; ideology - HH</w:t>
+            </w:r>
+          </w:p>
+        </w:tc>
+        <w:tc>
+          <w:tcPr>
+            <w:tcW w:type="dxa" w:w="2160"/>
+          </w:tcPr>
+          <w:p>
+            <w:r>
+              <w:t>Full (Choice/Control per house)</w:t>
+            </w:r>
+          </w:p>
+        </w:tc>
+        <w:tc>
+          <w:tcPr>
+            <w:tcW w:type="dxa" w:w="2160"/>
+          </w:tcPr>
+          <w:p>
+            <w:r>
+              <w:t>Full (reduced n)</w:t>
+            </w:r>
+          </w:p>
+        </w:tc>
+        <w:tc>
+          <w:tcPr>
+            <w:tcW w:type="dxa" w:w="2160"/>
+          </w:tcPr>
+          <w:p>
+            <w:r>
+              <w:t>Adapted: within precincts</w:t>
+            </w:r>
+          </w:p>
+        </w:tc>
+      </w:tr>
+      <w:tr>
+        <w:tc>
+          <w:tcPr>
+            <w:tcW w:type="dxa" w:w="2160"/>
+          </w:tcPr>
+          <w:p>
+            <w:r>
+              <w:t>9 Legitimation &amp; ideology - CL</w:t>
+            </w:r>
+          </w:p>
+        </w:tc>
+        <w:tc>
+          <w:tcPr>
+            <w:tcW w:type="dxa" w:w="2160"/>
+          </w:tcPr>
+          <w:p>
+            <w:r>
+              <w:t>Full (per residential group)</w:t>
+            </w:r>
+          </w:p>
+        </w:tc>
+        <w:tc>
+          <w:tcPr>
+            <w:tcW w:type="dxa" w:w="2160"/>
+          </w:tcPr>
+          <w:p>
+            <w:r>
+              <w:t>Adapted: per sub-phase clusters</w:t>
+            </w:r>
+          </w:p>
+        </w:tc>
+        <w:tc>
+          <w:tcPr>
+            <w:tcW w:type="dxa" w:w="2160"/>
+          </w:tcPr>
+          <w:p>
+            <w:r>
+              <w:t>Full: per precinct</w:t>
+            </w:r>
+          </w:p>
+        </w:tc>
+      </w:tr>
+      <w:tr>
+        <w:tc>
+          <w:tcPr>
+            <w:tcW w:type="dxa" w:w="2160"/>
+          </w:tcPr>
+          <w:p>
+            <w:r>
+              <w:t>9 Legitimation &amp; ideology - ST</w:t>
+            </w:r>
+          </w:p>
+        </w:tc>
+        <w:tc>
+          <w:tcPr>
+            <w:tcW w:type="dxa" w:w="2160"/>
+          </w:tcPr>
+          <w:p>
+            <w:r>
+              <w:t>Full (agent passage frequency)</w:t>
+            </w:r>
+          </w:p>
+        </w:tc>
+        <w:tc>
+          <w:tcPr>
+            <w:tcW w:type="dxa" w:w="2160"/>
+          </w:tcPr>
+          <w:p>
+            <w:r>
+              <w:t>Adapted: agent runs within exposure edges</w:t>
+            </w:r>
+          </w:p>
+        </w:tc>
+        <w:tc>
+          <w:tcPr>
+            <w:tcW w:type="dxa" w:w="2160"/>
+          </w:tcPr>
+          <w:p>
+            <w:r>
+              <w:t>Adapted: segment Choice substitutes for agent simulation on skeleton graphs</w:t>
+            </w:r>
+          </w:p>
+        </w:tc>
+      </w:tr>
+      <w:tr>
+        <w:tc>
+          <w:tcPr>
+            <w:tcW w:type="dxa" w:w="2160"/>
+          </w:tcPr>
+          <w:p>
+            <w:r>
+              <w:t>10 Symbols - HH</w:t>
+            </w:r>
+          </w:p>
+        </w:tc>
+        <w:tc>
+          <w:tcPr>
+            <w:tcW w:type="dxa" w:w="2160"/>
+          </w:tcPr>
+          <w:p>
+            <w:r>
+              <w:t>Full (painted-pottery distribution x visibility)</w:t>
+            </w:r>
+          </w:p>
+        </w:tc>
+        <w:tc>
+          <w:tcPr>
+            <w:tcW w:type="dxa" w:w="2160"/>
+          </w:tcPr>
+          <w:p>
+            <w:r>
+              <w:t>Adapted: symbols concentrated in mortuary domain; joint type-context reading</w:t>
+            </w:r>
+          </w:p>
+        </w:tc>
+        <w:tc>
+          <w:tcPr>
+            <w:tcW w:type="dxa" w:w="2160"/>
+          </w:tcPr>
+          <w:p>
+            <w:r>
+              <w:t>Full within precincts (display contexts)</w:t>
+            </w:r>
+          </w:p>
+        </w:tc>
+      </w:tr>
+      <w:tr>
+        <w:tc>
+          <w:tcPr>
+            <w:tcW w:type="dxa" w:w="2160"/>
+          </w:tcPr>
+          <w:p>
+            <w:r>
+              <w:t>10 Symbols - CL</w:t>
+            </w:r>
+          </w:p>
+        </w:tc>
+        <w:tc>
+          <w:tcPr>
+            <w:tcW w:type="dxa" w:w="2160"/>
+          </w:tcPr>
+          <w:p>
+            <w:r>
+              <w:t>Full</w:t>
+            </w:r>
+          </w:p>
+        </w:tc>
+        <w:tc>
+          <w:tcPr>
+            <w:tcW w:type="dxa" w:w="2160"/>
+          </w:tcPr>
+          <w:p>
+            <w:r>
+              <w:t>Adapted (as above)</w:t>
+            </w:r>
+          </w:p>
+        </w:tc>
+        <w:tc>
+          <w:tcPr>
+            <w:tcW w:type="dxa" w:w="2160"/>
+          </w:tcPr>
+          <w:p>
+            <w:r>
+              <w:t>Full: per precinct</w:t>
+            </w:r>
+          </w:p>
+        </w:tc>
+      </w:tr>
+      <w:tr>
+        <w:tc>
+          <w:tcPr>
+            <w:tcW w:type="dxa" w:w="2160"/>
+          </w:tcPr>
+          <w:p>
+            <w:r>
+              <w:t>10 Symbols - ST</w:t>
+            </w:r>
+          </w:p>
+        </w:tc>
+        <w:tc>
+          <w:tcPr>
+            <w:tcW w:type="dxa" w:w="2160"/>
+          </w:tcPr>
+          <w:p>
+            <w:r>
+              <w:t>Full (VGA visual integration of open space)</w:t>
+            </w:r>
+          </w:p>
+        </w:tc>
+        <w:tc>
+          <w:tcPr>
+            <w:tcW w:type="dxa" w:w="2160"/>
+          </w:tcPr>
+          <w:p>
+            <w:r>
+              <w:t>Adapted: exposure-conditioned VGA</w:t>
+            </w:r>
+          </w:p>
+        </w:tc>
+        <w:tc>
+          <w:tcPr>
+            <w:tcW w:type="dxa" w:w="2160"/>
+          </w:tcPr>
+          <w:p>
+            <w:r>
+              <w:t>Adapted: monumental walls/gates VGA, reconstruction-dependent</w:t>
+            </w:r>
+          </w:p>
+        </w:tc>
+      </w:tr>
+    </w:tbl>
+    <w:p>
+      <w:r>
+        <w:t>Three structural observations the pre-assessment already licenses, to be confirmed or corrected during digitization. First, no site loses a tendency wholesale: even the weakest cells degrade to Adapted or to a reported absence, so the ten-row architecture of Table 1 survives contact with all three records. Second, the pattern of restrictions is complementary rather than cumulative: Jiahu is strongest exactly where Jiangzhai is weakest (spatial mortuary linkage) and weakest where Taosi is strongest (ritual architecture), which strengthens the sequence as a whole. Third, the Taosi column shows the scale split that H-C predicts would matter: precinct-scale cells run near-fully while settlement-scale cells depend on the skeleton reconstruction, so the scalar-coexistence hypothesis is evaluated exactly where the data are, and the reconstruction sensitivity is part of the test rather than a nuisance.</w:t>
+      </w:r>
+    </w:p>
+    <w:p>
+      <w:pPr>
         <w:pStyle w:val="Heading1"/>
       </w:pPr>
       <w:r>

</xml_diff>